<commit_message>
Update SIEM monitoring documentation to reflect Thin Line Azure/Sentinel integration
This commit revises the SIEM monitoring and weekly review documentation to clarify the role of Thin Line in managing Azure/Sentinel resources. Key changes include updated descriptions in the interface approval packet, README, and forms, emphasizing the addendum's purpose in supplementing agency SIEM programs. The weekly review log and associated templates have also been adjusted to align with the new structure, ensuring comprehensive guidance for agencies in their monitoring processes.
</commit_message>
<xml_diff>
--- a/internal/compliance/tlets/forms/cloud-data-storage-disclosure-template.docx
+++ b/internal/compliance/tlets/forms/cloud-data-storage-disclosure-template.docx
@@ -2811,7 +2811,7 @@
   <w:abstractNum w:abstractNumId="0" w15:restartNumberingAfterBreak="0">
     <w:nsid w:val="FFFFFF89"/>
     <w:multiLevelType w:val="singleLevel"/>
-    <w:tmpl w:val="00E6B960"/>
+    <w:tmpl w:val="871A6964"/>
     <w:lvl w:ilvl="0">
       <w:start w:val="1"/>
       <w:numFmt w:val="bullet"/>
@@ -2829,7 +2829,7 @@
       </w:rPr>
     </w:lvl>
   </w:abstractNum>
-  <w:num w:numId="1" w16cid:durableId="1903590047">
+  <w:num w:numId="1" w16cid:durableId="338848946">
     <w:abstractNumId w:val="0"/>
   </w:num>
 </w:numbering>
@@ -3243,7 +3243,7 @@
     <w:link w:val="Heading1Char"/>
     <w:uiPriority w:val="9"/>
     <w:qFormat/>
-    <w:rsid w:val="00594E4F"/>
+    <w:rsid w:val="007876EA"/>
     <w:pPr>
       <w:keepNext/>
       <w:keepLines/>
@@ -3265,7 +3265,7 @@
     <w:uiPriority w:val="9"/>
     <w:unhideWhenUsed/>
     <w:qFormat/>
-    <w:rsid w:val="00594E4F"/>
+    <w:rsid w:val="007876EA"/>
     <w:pPr>
       <w:keepNext/>
       <w:keepLines/>
@@ -3287,7 +3287,7 @@
     <w:uiPriority w:val="9"/>
     <w:unhideWhenUsed/>
     <w:qFormat/>
-    <w:rsid w:val="00594E4F"/>
+    <w:rsid w:val="007876EA"/>
     <w:pPr>
       <w:keepNext/>
       <w:keepLines/>
@@ -3310,7 +3310,7 @@
     <w:semiHidden/>
     <w:unhideWhenUsed/>
     <w:qFormat/>
-    <w:rsid w:val="00594E4F"/>
+    <w:rsid w:val="007876EA"/>
     <w:pPr>
       <w:keepNext/>
       <w:keepLines/>
@@ -3333,7 +3333,7 @@
     <w:semiHidden/>
     <w:unhideWhenUsed/>
     <w:qFormat/>
-    <w:rsid w:val="00594E4F"/>
+    <w:rsid w:val="007876EA"/>
     <w:pPr>
       <w:keepNext/>
       <w:keepLines/>
@@ -3354,7 +3354,7 @@
     <w:semiHidden/>
     <w:unhideWhenUsed/>
     <w:qFormat/>
-    <w:rsid w:val="00594E4F"/>
+    <w:rsid w:val="007876EA"/>
     <w:pPr>
       <w:keepNext/>
       <w:keepLines/>
@@ -3377,7 +3377,7 @@
     <w:semiHidden/>
     <w:unhideWhenUsed/>
     <w:qFormat/>
-    <w:rsid w:val="00594E4F"/>
+    <w:rsid w:val="007876EA"/>
     <w:pPr>
       <w:keepNext/>
       <w:keepLines/>
@@ -3398,7 +3398,7 @@
     <w:semiHidden/>
     <w:unhideWhenUsed/>
     <w:qFormat/>
-    <w:rsid w:val="00594E4F"/>
+    <w:rsid w:val="007876EA"/>
     <w:pPr>
       <w:keepNext/>
       <w:keepLines/>
@@ -3421,7 +3421,7 @@
     <w:semiHidden/>
     <w:unhideWhenUsed/>
     <w:qFormat/>
-    <w:rsid w:val="00594E4F"/>
+    <w:rsid w:val="007876EA"/>
     <w:pPr>
       <w:keepNext/>
       <w:keepLines/>
@@ -3465,7 +3465,7 @@
     <w:basedOn w:val="DefaultParagraphFont"/>
     <w:link w:val="Heading1"/>
     <w:uiPriority w:val="9"/>
-    <w:rsid w:val="00594E4F"/>
+    <w:rsid w:val="007876EA"/>
     <w:rPr>
       <w:rFonts w:asciiTheme="majorHAnsi" w:eastAsiaTheme="majorEastAsia" w:hAnsiTheme="majorHAnsi" w:cstheme="majorBidi"/>
       <w:color w:val="0F4761" w:themeColor="accent1" w:themeShade="BF"/>
@@ -3478,7 +3478,7 @@
     <w:basedOn w:val="DefaultParagraphFont"/>
     <w:link w:val="Heading2"/>
     <w:uiPriority w:val="9"/>
-    <w:rsid w:val="00594E4F"/>
+    <w:rsid w:val="007876EA"/>
     <w:rPr>
       <w:rFonts w:asciiTheme="majorHAnsi" w:eastAsiaTheme="majorEastAsia" w:hAnsiTheme="majorHAnsi" w:cstheme="majorBidi"/>
       <w:color w:val="0F4761" w:themeColor="accent1" w:themeShade="BF"/>
@@ -3491,7 +3491,7 @@
     <w:basedOn w:val="DefaultParagraphFont"/>
     <w:link w:val="Heading3"/>
     <w:uiPriority w:val="9"/>
-    <w:rsid w:val="00594E4F"/>
+    <w:rsid w:val="007876EA"/>
     <w:rPr>
       <w:rFonts w:eastAsiaTheme="majorEastAsia" w:cstheme="majorBidi"/>
       <w:color w:val="0F4761" w:themeColor="accent1" w:themeShade="BF"/>
@@ -3505,7 +3505,7 @@
     <w:link w:val="Heading4"/>
     <w:uiPriority w:val="9"/>
     <w:semiHidden/>
-    <w:rsid w:val="00594E4F"/>
+    <w:rsid w:val="007876EA"/>
     <w:rPr>
       <w:rFonts w:eastAsiaTheme="majorEastAsia" w:cstheme="majorBidi"/>
       <w:i/>
@@ -3519,7 +3519,7 @@
     <w:link w:val="Heading5"/>
     <w:uiPriority w:val="9"/>
     <w:semiHidden/>
-    <w:rsid w:val="00594E4F"/>
+    <w:rsid w:val="007876EA"/>
     <w:rPr>
       <w:rFonts w:eastAsiaTheme="majorEastAsia" w:cstheme="majorBidi"/>
       <w:color w:val="0F4761" w:themeColor="accent1" w:themeShade="BF"/>
@@ -3531,7 +3531,7 @@
     <w:link w:val="Heading6"/>
     <w:uiPriority w:val="9"/>
     <w:semiHidden/>
-    <w:rsid w:val="00594E4F"/>
+    <w:rsid w:val="007876EA"/>
     <w:rPr>
       <w:rFonts w:eastAsiaTheme="majorEastAsia" w:cstheme="majorBidi"/>
       <w:i/>
@@ -3545,7 +3545,7 @@
     <w:link w:val="Heading7"/>
     <w:uiPriority w:val="9"/>
     <w:semiHidden/>
-    <w:rsid w:val="00594E4F"/>
+    <w:rsid w:val="007876EA"/>
     <w:rPr>
       <w:rFonts w:eastAsiaTheme="majorEastAsia" w:cstheme="majorBidi"/>
       <w:color w:val="595959" w:themeColor="text1" w:themeTint="A6"/>
@@ -3557,7 +3557,7 @@
     <w:link w:val="Heading8"/>
     <w:uiPriority w:val="9"/>
     <w:semiHidden/>
-    <w:rsid w:val="00594E4F"/>
+    <w:rsid w:val="007876EA"/>
     <w:rPr>
       <w:rFonts w:eastAsiaTheme="majorEastAsia" w:cstheme="majorBidi"/>
       <w:i/>
@@ -3571,7 +3571,7 @@
     <w:link w:val="Heading9"/>
     <w:uiPriority w:val="9"/>
     <w:semiHidden/>
-    <w:rsid w:val="00594E4F"/>
+    <w:rsid w:val="007876EA"/>
     <w:rPr>
       <w:rFonts w:eastAsiaTheme="majorEastAsia" w:cstheme="majorBidi"/>
       <w:color w:val="272727" w:themeColor="text1" w:themeTint="D8"/>
@@ -3584,7 +3584,7 @@
     <w:link w:val="TitleChar"/>
     <w:uiPriority w:val="10"/>
     <w:qFormat/>
-    <w:rsid w:val="00594E4F"/>
+    <w:rsid w:val="007876EA"/>
     <w:pPr>
       <w:spacing w:after="80" w:line="240" w:lineRule="auto"/>
       <w:contextualSpacing/>
@@ -3602,7 +3602,7 @@
     <w:basedOn w:val="DefaultParagraphFont"/>
     <w:link w:val="Title"/>
     <w:uiPriority w:val="10"/>
-    <w:rsid w:val="00594E4F"/>
+    <w:rsid w:val="007876EA"/>
     <w:rPr>
       <w:rFonts w:asciiTheme="majorHAnsi" w:eastAsiaTheme="majorEastAsia" w:hAnsiTheme="majorHAnsi" w:cstheme="majorBidi"/>
       <w:spacing w:val="-10"/>
@@ -3618,7 +3618,7 @@
     <w:link w:val="SubtitleChar"/>
     <w:uiPriority w:val="11"/>
     <w:qFormat/>
-    <w:rsid w:val="00594E4F"/>
+    <w:rsid w:val="007876EA"/>
     <w:pPr>
       <w:numPr>
         <w:ilvl w:val="1"/>
@@ -3637,7 +3637,7 @@
     <w:basedOn w:val="DefaultParagraphFont"/>
     <w:link w:val="Subtitle"/>
     <w:uiPriority w:val="11"/>
-    <w:rsid w:val="00594E4F"/>
+    <w:rsid w:val="007876EA"/>
     <w:rPr>
       <w:rFonts w:eastAsiaTheme="majorEastAsia" w:cstheme="majorBidi"/>
       <w:color w:val="595959" w:themeColor="text1" w:themeTint="A6"/>
@@ -3653,7 +3653,7 @@
     <w:link w:val="QuoteChar"/>
     <w:uiPriority w:val="29"/>
     <w:qFormat/>
-    <w:rsid w:val="00594E4F"/>
+    <w:rsid w:val="007876EA"/>
     <w:pPr>
       <w:spacing w:before="160"/>
       <w:jc w:val="center"/>
@@ -3669,7 +3669,7 @@
     <w:basedOn w:val="DefaultParagraphFont"/>
     <w:link w:val="Quote"/>
     <w:uiPriority w:val="29"/>
-    <w:rsid w:val="00594E4F"/>
+    <w:rsid w:val="007876EA"/>
     <w:rPr>
       <w:i/>
       <w:iCs/>
@@ -3681,7 +3681,7 @@
     <w:basedOn w:val="Normal"/>
     <w:uiPriority w:val="34"/>
     <w:qFormat/>
-    <w:rsid w:val="00594E4F"/>
+    <w:rsid w:val="007876EA"/>
     <w:pPr>
       <w:ind w:left="720"/>
       <w:contextualSpacing/>
@@ -3692,7 +3692,7 @@
     <w:basedOn w:val="DefaultParagraphFont"/>
     <w:uiPriority w:val="21"/>
     <w:qFormat/>
-    <w:rsid w:val="00594E4F"/>
+    <w:rsid w:val="007876EA"/>
     <w:rPr>
       <w:i/>
       <w:iCs/>
@@ -3706,7 +3706,7 @@
     <w:link w:val="IntenseQuoteChar"/>
     <w:uiPriority w:val="30"/>
     <w:qFormat/>
-    <w:rsid w:val="00594E4F"/>
+    <w:rsid w:val="007876EA"/>
     <w:pPr>
       <w:pBdr>
         <w:top w:val="single" w:sz="4" w:space="10" w:color="0F4761" w:themeColor="accent1" w:themeShade="BF"/>
@@ -3727,7 +3727,7 @@
     <w:basedOn w:val="DefaultParagraphFont"/>
     <w:link w:val="IntenseQuote"/>
     <w:uiPriority w:val="30"/>
-    <w:rsid w:val="00594E4F"/>
+    <w:rsid w:val="007876EA"/>
     <w:rPr>
       <w:i/>
       <w:iCs/>
@@ -3739,7 +3739,7 @@
     <w:basedOn w:val="DefaultParagraphFont"/>
     <w:uiPriority w:val="32"/>
     <w:qFormat/>
-    <w:rsid w:val="00594E4F"/>
+    <w:rsid w:val="007876EA"/>
     <w:rPr>
       <w:b/>
       <w:bCs/>
@@ -3753,7 +3753,7 @@
     <w:basedOn w:val="Normal"/>
     <w:uiPriority w:val="99"/>
     <w:unhideWhenUsed/>
-    <w:rsid w:val="00594E4F"/>
+    <w:rsid w:val="007876EA"/>
     <w:pPr>
       <w:numPr>
         <w:numId w:val="1"/>

</xml_diff>